<commit_message>
did a lot of html
</commit_message>
<xml_diff>
--- a/Cotrina-site-plan-working-copy.docx
+++ b/Cotrina-site-plan-working-copy.docx
@@ -669,6 +669,35 @@
     </w:p>
     <w:p>
       <w:pPr>
+        <w:pStyle w:val="Heading4"/>
+        <w:jc w:val="center"/>
+        <w:rPr>
+          <w:rFonts w:eastAsia="Times New Roman"/>
+        </w:rPr>
+      </w:pPr>
+      <w:r>
+        <w:rPr>
+          <w:rFonts w:eastAsia="Times New Roman"/>
+        </w:rPr>
+        <w:t>@import url('</w:t>
+      </w:r>
+      <w:proofErr w:type="gramStart"/>
+      <w:r>
+        <w:rPr>
+          <w:rFonts w:eastAsia="Times New Roman"/>
+        </w:rPr>
+        <w:t>https://fonts.googleapis.com/css2?family=Bitcount+Grid+Double:wght@100..</w:t>
+      </w:r>
+      <w:proofErr w:type="gramEnd"/>
+      <w:r>
+        <w:rPr>
+          <w:rFonts w:eastAsia="Times New Roman"/>
+        </w:rPr>
+        <w:t>900&amp;family=Share+Tech&amp;display=swap');</w:t>
+      </w:r>
+    </w:p>
+    <w:p>
+      <w:pPr>
         <w:pStyle w:val="Heading3"/>
         <w:jc w:val="center"/>
         <w:rPr>
@@ -1033,7 +1062,6 @@
         <w:rPr>
           <w:rFonts w:eastAsia="Times New Roman"/>
         </w:rPr>
-        <w:lastRenderedPageBreak/>
         <w:t>Fun Factor</w:t>
       </w:r>
     </w:p>
@@ -1443,6 +1471,7 @@
           <w:noProof/>
           <w:lang w:val="es-PE"/>
         </w:rPr>
+        <w:lastRenderedPageBreak/>
         <w:drawing>
           <wp:inline distT="0" distB="0" distL="0" distR="0" wp14:anchorId="19252870" wp14:editId="07A936FA">
             <wp:extent cx="2265986" cy="1274618"/>
@@ -1504,7 +1533,6 @@
         <w:rPr>
           <w:rFonts w:eastAsia="Times New Roman"/>
         </w:rPr>
-        <w:lastRenderedPageBreak/>
         <w:t>Genshin Impact</w:t>
       </w:r>
     </w:p>
@@ -1836,6 +1864,7 @@
           <w:noProof/>
           <w:lang w:val="es-PE"/>
         </w:rPr>
+        <w:lastRenderedPageBreak/>
         <w:drawing>
           <wp:inline distT="0" distB="0" distL="0" distR="0" wp14:anchorId="794BC049" wp14:editId="1E5559E8">
             <wp:extent cx="3004093" cy="1863436"/>
@@ -1901,7 +1930,6 @@
           <w:b/>
           <w:bCs/>
         </w:rPr>
-        <w:lastRenderedPageBreak/>
         <w:t xml:space="preserve">PAGE 3: </w:t>
       </w:r>
       <w:r>
@@ -2248,6 +2276,7 @@
         <w:rPr>
           <w:rFonts w:eastAsia="Times New Roman"/>
         </w:rPr>
+        <w:lastRenderedPageBreak/>
         <w:t xml:space="preserve">Genre tags: </w:t>
       </w:r>
       <w:r>
@@ -2340,7 +2369,6 @@
         <w:rPr>
           <w:rFonts w:eastAsia="Times New Roman"/>
         </w:rPr>
-        <w:lastRenderedPageBreak/>
         <w:t>Hollow Knight</w:t>
       </w:r>
     </w:p>
@@ -2731,6 +2759,7 @@
           <w:noProof/>
           <w:lang w:val="es-PE"/>
         </w:rPr>
+        <w:lastRenderedPageBreak/>
         <w:drawing>
           <wp:inline distT="0" distB="0" distL="0" distR="0" wp14:anchorId="1D165F9E" wp14:editId="67B9999A">
             <wp:extent cx="2265218" cy="1202066"/>

</xml_diff>